<commit_message>
download button edit and correct document path
</commit_message>
<xml_diff>
--- a/docs/chapter_downloads/10-Lipid_Catabolism.docx
+++ b/docs/chapter_downloads/10-Lipid_Catabolism.docx
@@ -28,6 +28,15 @@
         </w:p>
       </w:sdtContent>
     </w:sdt>
+    <w:bookmarkStart w:id="25" w:name="lipid-catabolism"/>
+    <w:p>
+      <w:pPr>
+        <w:pStyle w:val="Heading1"/>
+      </w:pPr>
+      <w:r>
+        <w:t xml:space="preserve">Lipid Catabolism</w:t>
+      </w:r>
+    </w:p>
     <w:bookmarkStart w:id="9" w:name="overview"/>
     <w:p>
       <w:pPr>
@@ -4077,6 +4086,7 @@
       </w:r>
     </w:p>
     <w:bookmarkEnd w:id="24"/>
+    <w:bookmarkEnd w:id="25"/>
     <w:sectPr>
       <w:footnotePr>
         <w:numRestart w:val="eachSect"/>

</xml_diff>